<commit_message>
perbaikan bug wa gateway
</commit_message>
<xml_diff>
--- a/aplikasi web/WA_GATEWAY/📘 DOKUMENTASI DEPLOYMENT WA GATEWAY.docx
+++ b/aplikasi web/WA_GATEWAY/📘 DOKUMENTASI DEPLOYMENT WA GATEWAY.docx
@@ -1582,6 +1582,60 @@
         <w:t>axios</w:t>
       </w:r>
       <w:proofErr w:type="spellEnd"/>
+      <w:r>
+        <w:rPr>
+          <w:rFonts w:ascii="Courier New" w:eastAsia="Times New Roman" w:hAnsi="Courier New" w:cs="Courier New"/>
+          <w:sz w:val="20"/>
+          <w:szCs w:val="20"/>
+          <w:lang w:val="id-ID" w:eastAsia="id-ID"/>
+          <w14:ligatures w14:val="none"/>
+        </w:rPr>
+        <w:t xml:space="preserve"> </w:t>
+      </w:r>
+      <w:proofErr w:type="spellStart"/>
+      <w:r>
+        <w:rPr>
+          <w:rFonts w:ascii="Courier New" w:eastAsia="Times New Roman" w:hAnsi="Courier New" w:cs="Courier New"/>
+          <w:sz w:val="20"/>
+          <w:szCs w:val="20"/>
+          <w:lang w:val="id-ID" w:eastAsia="id-ID"/>
+          <w14:ligatures w14:val="none"/>
+        </w:rPr>
+        <w:t>puppeteer-extra</w:t>
+      </w:r>
+      <w:proofErr w:type="spellEnd"/>
+      <w:r>
+        <w:rPr>
+          <w:rFonts w:ascii="Courier New" w:eastAsia="Times New Roman" w:hAnsi="Courier New" w:cs="Courier New"/>
+          <w:sz w:val="20"/>
+          <w:szCs w:val="20"/>
+          <w:lang w:val="id-ID" w:eastAsia="id-ID"/>
+          <w14:ligatures w14:val="none"/>
+        </w:rPr>
+        <w:t xml:space="preserve"> </w:t>
+      </w:r>
+      <w:proofErr w:type="spellStart"/>
+      <w:r>
+        <w:rPr>
+          <w:rFonts w:ascii="Courier New" w:eastAsia="Times New Roman" w:hAnsi="Courier New" w:cs="Courier New"/>
+          <w:sz w:val="20"/>
+          <w:szCs w:val="20"/>
+          <w:lang w:val="id-ID" w:eastAsia="id-ID"/>
+          <w14:ligatures w14:val="none"/>
+        </w:rPr>
+        <w:t>puppeteer-extra-plugin-stealth</w:t>
+      </w:r>
+      <w:proofErr w:type="spellEnd"/>
+      <w:r>
+        <w:rPr>
+          <w:rFonts w:ascii="Courier New" w:eastAsia="Times New Roman" w:hAnsi="Courier New" w:cs="Courier New"/>
+          <w:sz w:val="20"/>
+          <w:szCs w:val="20"/>
+          <w:lang w:val="id-ID" w:eastAsia="id-ID"/>
+          <w14:ligatures w14:val="none"/>
+        </w:rPr>
+        <w:t xml:space="preserve"> </w:t>
+      </w:r>
     </w:p>
     <w:p>
       <w:pPr>

</xml_diff>